<commit_message>
Fix paths after Romane repo reorganization
- conda.yaml: requirements.txt -> requirements/base.txt
- generate scripts: docker-compose.dev.yml -> docker/docker-compose.dev.yml
- generate scripts: Dockerfile.mlflow -> docker/mlflow/Dockerfile
- generate scripts: reports/ -> reports/Sara/
- regenerate Guide_Test_Phase2.docx, Phases1_2_etat_des_lieux.docx, Guide_Test_Phases1_2.docx

Co-Authored-By: Claude Sonnet 4.6 <noreply@anthropic.com>
</commit_message>
<xml_diff>
--- a/reports/Sara/Guide_Test_Phase2.docx
+++ b/reports/Sara/Guide_Test_Phase2.docx
@@ -159,7 +159,7 @@
           <w:color w:val="C05000"/>
           <w:sz w:val="18"/>
         </w:rPr>
-        <w:t>⚠️  Si le port 5001 est occupé, arrêter l'application qui l'utilise ou modifier le mapping dans docker-compose.dev.yml.</w:t>
+        <w:t>⚠️  Si le port 5001 est occupé, arrêter l'application qui l'utilise ou modifier le mapping dans docker/docker-compose.dev.yml.</w:t>
       </w:r>
     </w:p>
     <w:p>
@@ -240,7 +240,7 @@
         <w:br/>
         <w:t># Construire et démarrer le container MLflow</w:t>
         <w:br/>
-        <w:t>docker-compose -f docker-compose.dev.yml up -d --build mlflow</w:t>
+        <w:t>docker-compose -f docker/docker-compose.dev.yml up -d --build mlflow</w:t>
       </w:r>
     </w:p>
     <w:p>
@@ -358,7 +358,7 @@
           <w:color w:val="202020"/>
           <w:sz w:val="17"/>
         </w:rPr>
-        <w:t>docker-compose -f docker-compose.dev.yml stop mlflow</w:t>
+        <w:t>docker-compose -f docker/docker-compose.dev.yml stop mlflow</w:t>
       </w:r>
     </w:p>
     <w:p>

</xml_diff>

<commit_message>
Update Guide_Test_Phase2: add troubleshooting + challenger via run
- Test 1: section dépannage (container name conflict, port 5001 occupé)
- Test 6: alternative pour déclencher @challenger via un vrai run (--seed 999)

Co-Authored-By: Claude Sonnet 4.6 <noreply@anthropic.com>
</commit_message>
<xml_diff>
--- a/reports/Sara/Guide_Test_Phase2.docx
+++ b/reports/Sara/Guide_Test_Phase2.docx
@@ -359,6 +359,123 @@
           <w:sz w:val="17"/>
         </w:rPr>
         <w:t>docker-compose -f docker/docker-compose.dev.yml stop mlflow</w:t>
+      </w:r>
+    </w:p>
+    <w:p>
+      <w:pPr>
+        <w:pStyle w:val="Heading3"/>
+      </w:pPr>
+      <w:r>
+        <w:t>Dépannage Test 1 — Erreurs courantes</w:t>
+      </w:r>
+    </w:p>
+    <w:p>
+      <w:r>
+        <w:rPr>
+          <w:b/>
+        </w:rPr>
+        <w:t>Erreur : container name already in use</w:t>
+      </w:r>
+    </w:p>
+    <w:p>
+      <w:pPr>
+        <w:ind w:left="283"/>
+        <w:shd w:val="clear" w:color="auto" w:fill="F0F0F0"/>
+      </w:pPr>
+      <w:r>
+        <w:rPr>
+          <w:rFonts w:ascii="Courier New" w:hAnsi="Courier New"/>
+          <w:color w:val="202020"/>
+          <w:sz w:val="17"/>
+        </w:rPr>
+        <w:t>Error response from daemon: Conflict. The container name "/blood_cell_mlflow"</w:t>
+        <w:br/>
+        <w:t>is already in use by container "xxxxxxxx".</w:t>
+      </w:r>
+    </w:p>
+    <w:p>
+      <w:r>
+        <w:t>Solution : supprimer le container existant puis relancer :</w:t>
+      </w:r>
+    </w:p>
+    <w:p>
+      <w:pPr>
+        <w:ind w:left="283"/>
+        <w:shd w:val="clear" w:color="auto" w:fill="F0F0F0"/>
+      </w:pPr>
+      <w:r>
+        <w:rPr>
+          <w:rFonts w:ascii="Courier New" w:hAnsi="Courier New"/>
+          <w:color w:val="202020"/>
+          <w:sz w:val="17"/>
+        </w:rPr>
+        <w:t>docker compose -f docker/docker-compose.dev.yml down mlflow</w:t>
+        <w:br/>
+        <w:t>docker compose -f docker/docker-compose.dev.yml up -d --build mlflow</w:t>
+      </w:r>
+    </w:p>
+    <w:p>
+      <w:r>
+        <w:rPr>
+          <w:i/>
+          <w:color w:val="1F497D"/>
+          <w:sz w:val="18"/>
+        </w:rPr>
+        <w:t>ℹ️  Alternative si tu veux juste redémarrer sans rebuild : docker compose -f docker/docker-compose.dev.yml restart mlflow</w:t>
+      </w:r>
+    </w:p>
+    <w:p>
+      <w:r>
+        <w:rPr>
+          <w:b/>
+        </w:rPr>
+        <w:t>Erreur : port 5001 already allocated</w:t>
+      </w:r>
+    </w:p>
+    <w:p>
+      <w:pPr>
+        <w:ind w:left="283"/>
+        <w:shd w:val="clear" w:color="auto" w:fill="F0F0F0"/>
+      </w:pPr>
+      <w:r>
+        <w:rPr>
+          <w:rFonts w:ascii="Courier New" w:hAnsi="Courier New"/>
+          <w:color w:val="202020"/>
+          <w:sz w:val="17"/>
+        </w:rPr>
+        <w:t>Error response from daemon: driver failed programming external connectivity:</w:t>
+        <w:br/>
+        <w:t>Bind for 0.0.0.0:5001 failed: port is already allocated.</w:t>
+      </w:r>
+    </w:p>
+    <w:p>
+      <w:r>
+        <w:t>Solution : trouver et arrêter le processus qui utilise le port :</w:t>
+      </w:r>
+    </w:p>
+    <w:p>
+      <w:pPr>
+        <w:ind w:left="283"/>
+        <w:shd w:val="clear" w:color="auto" w:fill="F0F0F0"/>
+      </w:pPr>
+      <w:r>
+        <w:rPr>
+          <w:rFonts w:ascii="Courier New" w:hAnsi="Courier New"/>
+          <w:color w:val="202020"/>
+          <w:sz w:val="17"/>
+        </w:rPr>
+        <w:t># Windows</w:t>
+        <w:br/>
+        <w:t>Get-Process -Id (Get-NetTCPConnection -LocalPort 5001).OwningProcess</w:t>
+        <w:br/>
+        <w:t>Stop-Process -Id &lt;PID&gt; -Force</w:t>
+        <w:br/>
+        <w:br/>
+        <w:t># Mac</w:t>
+        <w:br/>
+        <w:t>lsof -i :5001</w:t>
+        <w:br/>
+        <w:t>kill -9 &lt;PID&gt;</w:t>
       </w:r>
     </w:p>
     <w:p>
@@ -1374,6 +1491,72 @@
           <w:sz w:val="18"/>
         </w:rPr>
         <w:t>⚠️  Sur Windows : lancer avec $env:PYTHONIOENCODING='utf-8' pour éviter l'erreur d'encodage des emojis MLflow.</w:t>
+      </w:r>
+    </w:p>
+    <w:p>
+      <w:pPr>
+        <w:pStyle w:val="Heading3"/>
+      </w:pPr>
+      <w:r>
+        <w:t>Alternative — Déclencher @challenger via un vrai run</w:t>
+      </w:r>
+    </w:p>
+    <w:p>
+      <w:r>
+        <w:t>Il est aussi possible de faire apparaître @challenger en lançant un nouvel entraînement dont les métriques sont inférieures à la version @production. Le garde-fou bloque alors la promotion et le nouveau modèle reste @challenger.</w:t>
+      </w:r>
+    </w:p>
+    <w:p>
+      <w:r>
+        <w:rPr>
+          <w:i/>
+          <w:color w:val="C05000"/>
+          <w:sz w:val="18"/>
+        </w:rPr>
+        <w:t>⚠️  Avec 100 images et 1 epoch, le résultat est aléatoire : le run peut aussi passer les garde-fous et devenir @production (Version N+1 sans challenger). Utiliser --seed 999 augmente les chances d'obtenir de mauvaises métriques.</w:t>
+      </w:r>
+    </w:p>
+    <w:p>
+      <w:pPr>
+        <w:ind w:left="283"/>
+        <w:shd w:val="clear" w:color="auto" w:fill="F0F0F0"/>
+      </w:pPr>
+      <w:r>
+        <w:rPr>
+          <w:rFonts w:ascii="Courier New" w:hAnsi="Courier New"/>
+          <w:color w:val="202020"/>
+          <w:sz w:val="17"/>
+        </w:rPr>
+        <w:t># Windows (PowerShell)</w:t>
+        <w:br/>
+        <w:t>python -m src.train.training `</w:t>
+        <w:br/>
+        <w:t xml:space="preserve">  --data-dir data/Source_100 --output-dir models `</w:t>
+        <w:br/>
+        <w:t xml:space="preserve">  --epochs-head 1 --epochs-full 1 --batch-size 8 `</w:t>
+        <w:br/>
+        <w:t xml:space="preserve">  --run-type base --part 0 --seed 999</w:t>
+        <w:br/>
+        <w:br/>
+        <w:t># Mac</w:t>
+        <w:br/>
+        <w:t>python -m src.train.training \</w:t>
+        <w:br/>
+        <w:t xml:space="preserve">  --data-dir data/Source_100 --output-dir models \</w:t>
+        <w:br/>
+        <w:t xml:space="preserve">  --epochs-head 1 --epochs-full 1 --batch-size 8 \</w:t>
+        <w:br/>
+        <w:t xml:space="preserve">  --run-type base --part 0 --seed 999</w:t>
+      </w:r>
+    </w:p>
+    <w:p>
+      <w:r>
+        <w:rPr>
+          <w:i/>
+          <w:color w:val="1F497D"/>
+          <w:sz w:val="18"/>
+        </w:rPr>
+        <w:t>ℹ️  Si le run échoue les garde-fous → Version N+1 reçoit @challenger dans le Registry. Si le run les passe → Version N+1 devient @production (démo moins parlante). Pour une démo garantie, préférer scripts/demo_garde_fou.py (résultat certain, ~5 sec).</w:t>
       </w:r>
     </w:p>
     <w:p>

</xml_diff>